<commit_message>
B6: keep focus as planned, test converting out-of-focus terms
Queen and cooling stay out of focus; the 23 out-of-focus campaigns converting
above 3x market CVR at top of search get a two-week +10% test inside the loss
stop (Queen on the olive child). B4 document left unchanged.

Co-Authored-By: Claude Opus 5.5 <noreply@anthropic.com>
Claude-Session: https://claude.ai/code/session_01FvXHKtbYmE3ru99HYV2muV
</commit_message>
<xml_diff>
--- a/docs/DBS6_Corrections_by_Situation_20260921-f066a8f0.docx
+++ b/docs/DBS6_Corrections_by_Situation_20260921-f066a8f0.docx
@@ -2639,7 +2639,148 @@
         <w:pStyle w:val="Heading1"/>
       </w:pPr>
       <w:r>
-        <w:t>B.1 92 out-of-focus campaigns under 15 clicks — hold them flat</w:t>
+        <w:t>B.1 23 out-of-focus campaigns that convert at the top — a two-week test</w:t>
+      </w:r>
+    </w:p>
+    <w:p>
+      <w:pPr>
+        <w:spacing w:after="100"/>
+      </w:pPr>
+      <w:r>
+        <w:rPr>
+          <w:b/>
+          <w:color w:val="1F3A5F"/>
+        </w:rPr>
+        <w:t xml:space="preserve">The rule. </w:t>
+      </w:r>
+      <w:r>
+        <w:rPr>
+          <w:b w:val="0"/>
+          <w:i w:val="0"/>
+        </w:rPr>
+        <w:t>Focus stays as the plan sets it on every syntax (operator 2026-09-23): Bamboo|Queen and the cooling groups stay out of focus. But an out-of-focus term that already converts at top of search above the bar — 3× the market CVR of its group, on 15 or more top-of-search clicks in 90 days — is tested rather than held: top-of-search price +10% for two weeks (09-24 → 10-07), inside the same loss stop (3× contribution per top-of-search order), on a child that can ship. A campaign that went dark gets its pre-cut base back first; one whose rank collapsed gets the cause check the same day.</w:t>
+      </w:r>
+    </w:p>
+    <w:p>
+      <w:pPr>
+        <w:spacing w:after="100"/>
+      </w:pPr>
+      <w:r>
+        <w:rPr>
+          <w:b/>
+          <w:color w:val="1F3A5F"/>
+        </w:rPr>
+        <w:t xml:space="preserve">The read on 10-07. </w:t>
+      </w:r>
+      <w:r>
+        <w:rPr>
+          <w:b w:val="0"/>
+          <w:i w:val="0"/>
+        </w:rPr>
+        <w:t>Keep the test price where top-of-search clicks rose and top-of-search conversion stayed above the bar; put it back where they did not. The result is evidence for the next focus decision on Queen and Cooling, not a change of focus.</w:t>
+      </w:r>
+    </w:p>
+    <w:p>
+      <w:pPr>
+        <w:spacing w:after="100"/>
+      </w:pPr>
+      <w:r>
+        <w:rPr>
+          <w:b/>
+          <w:color w:val="1F3A5F"/>
+        </w:rPr>
+        <w:t xml:space="preserve">What the run did. </w:t>
+      </w:r>
+      <w:r>
+        <w:rPr>
+          <w:b w:val="0"/>
+          <w:i w:val="0"/>
+        </w:rPr>
+        <w:t>Raised the top-of-search price on 1, cut it on 3, held 15. By group: Bamboo|Queen 9, Cooling|King 9, Bamboo|King 3, Bamboo|Twin 1, Cooling|Full 1. Their situation otherwise: thin 8, rank collapse 5, went dark 5, faded 3, leak 1, working 1.</w:t>
+      </w:r>
+    </w:p>
+    <w:p>
+      <w:pPr>
+        <w:spacing w:after="100"/>
+        <w:ind w:left="227"/>
+      </w:pPr>
+      <w:r>
+        <w:rPr>
+          <w:b/>
+        </w:rPr>
+        <w:t>Bamboo Sheets Queen-(HSV)-Exact-(Ranking)-DO-BAMBOO-QUEEN-WHITE-6PCS</w:t>
+      </w:r>
+      <w:r>
+        <w:rPr>
+          <w:b w:val="0"/>
+          <w:i w:val="0"/>
+        </w:rPr>
+        <w:t xml:space="preserve"> — rank 32 → 52 in thirty days, target 5. 90 days: 463 clicks — 264 top of search, 197 product pages, 2 rest of search (57% / 43% / 0%), 78 orders. Last 14 days: 3 clicks — 0 top of search, 3 product pages, 0 rest of search (0% / 100% / 0%). Last 8 days (09-15 → 09-22): 0 top-of-search clicks (0.0/day, against 0.0/day in the 31 days before); last 3 days 0 clicks. Top-of-search impression share 4.53%. Budget $150.00/day, last 7 days 0% used. The run writes modifier 88% → 79%. Converts 59 of 264 top-of-search clicks (22%) against a bar of 13.3%. It has no enabled priced target on file today. Correction: re-enable its keyword and set the top-of-search price at its group’s market bound ($6.09), inside the stop ($19.27), as the test; advertise BAMBOO-QUEEN-OLIVE-6PCS — the hero BAMBOO-QUEEN-WHITE-6PCS is short; its rank collapsed — run the cause check the same day; read on 10-07</w:t>
+      </w:r>
+    </w:p>
+    <w:p>
+      <w:pPr>
+        <w:spacing w:after="100"/>
+        <w:ind w:left="227"/>
+      </w:pPr>
+      <w:r>
+        <w:rPr>
+          <w:b/>
+        </w:rPr>
+        <w:t>Decolure Bamboo Sheets-(MSV)-Exact-(Ranking)-DO-BAMBOO-KING-WHITE-6PCS</w:t>
+      </w:r>
+      <w:r>
+        <w:rPr>
+          <w:b w:val="0"/>
+          <w:i w:val="0"/>
+        </w:rPr>
+        <w:t xml:space="preserve"> — no rank on file. 90 days: 745 clicks — 221 top of search, 511 product pages, 13 rest of search (30% / 69% / 2%), 182 orders. Last 14 days: 107 clicks — 50 top of search, 57 product pages, 0 rest of search (47% / 53% / 0%). Last 8 days (09-15 → 09-22): 32 top-of-search clicks (4.0/day, against 1.5/day in the 31 days before); last 3 days 23 clicks. Top-of-search impression share 21.0%. Budget $100.00/day, last 7 days 12% used. Top of search converts 26.2% against a market 1.92%. The run writes modifier 101% → 91% — top-of-search price $4.24 → $4.03. Converts 58 of 221 top-of-search clicks (26%) against a bar of 5.8%. Correction: test +10% — TOS $4.24 → $4.67; a top-of-search order then costs up to $18 (still a profit of $10 against $27.37 contribution; stop at $21.55); read on 10-07</w:t>
+      </w:r>
+    </w:p>
+    <w:p>
+      <w:pPr>
+        <w:spacing w:after="100"/>
+        <w:ind w:left="227"/>
+      </w:pPr>
+      <w:r>
+        <w:rPr>
+          <w:b/>
+        </w:rPr>
+        <w:t>Bamboo Sheets Queen Size-(HSV)-Exact-(Ranking)-DO-BAMBOO-QUEEN-WHITE-6PCS</w:t>
+      </w:r>
+      <w:r>
+        <w:rPr>
+          <w:b w:val="0"/>
+          <w:i w:val="0"/>
+        </w:rPr>
+        <w:t xml:space="preserve"> — rank 17 → 34 in thirty days, target 5. 90 days: 1485 clicks — 213 top of search, 1265 product pages, 7 rest of search (14% / 85% / 0%), 189 orders. Last 14 days: 23 clicks — 5 top of search, 18 product pages, 0 rest of search (22% / 78% / 0%). Last 8 days (09-15 → 09-22): 3 top-of-search clicks (0.4/day, against 1.1/day in the 31 days before); last 3 days 4 clicks. Top-of-search impression share 2.01%. Budget $78.00/day, last 7 days 3% used. Top of search converts 20.7% against a market 4.21%. The run writes modifier 283% → 383%, base $1.19 → $0.94 — top-of-search price $4.56 → $4.54. Converts 44 of 213 top-of-search clicks (21%) against a bar of 12.6%. Correction: test +10% — TOS $4.56 → $5.01; a top-of-search order then costs up to $24 (still a profit of $2 against $26.49 contribution; stop at $16.42); advertise BAMBOO-QUEEN-OLIVE-6PCS — the hero BAMBOO-QUEEN-WHITE-6PCS is short; its rank collapsed — run the cause check the same day; read on 10-07</w:t>
+      </w:r>
+    </w:p>
+    <w:p>
+      <w:pPr>
+        <w:spacing w:after="100"/>
+      </w:pPr>
+      <w:r>
+        <w:rPr>
+          <w:b/>
+          <w:color w:val="1F3A5F"/>
+        </w:rPr>
+        <w:t xml:space="preserve">Correction. </w:t>
+      </w:r>
+      <w:r>
+        <w:rPr>
+          <w:b w:val="0"/>
+          <w:i w:val="0"/>
+        </w:rPr>
+        <w:t>Test all 23 for two weeks; do not cut any of them in the meantime.</w:t>
+      </w:r>
+    </w:p>
+    <w:p>
+      <w:pPr>
+        <w:pStyle w:val="Heading1"/>
+      </w:pPr>
+      <w:r>
+        <w:t>B.2 84 out-of-focus campaigns under 15 clicks — hold them flat</w:t>
       </w:r>
     </w:p>
     <w:p>
@@ -2677,7 +2818,7 @@
           <w:b w:val="0"/>
           <w:i w:val="0"/>
         </w:rPr>
-        <w:t>Held 90; moved 2 — raised the price on 1, cut it on 0.</w:t>
+        <w:t>Held 83; moved 1 — raised the price on 0, cut it on 0.</w:t>
       </w:r>
     </w:p>
     <w:p>
@@ -2697,25 +2838,6 @@
           <w:i w:val="0"/>
         </w:rPr>
         <w:t xml:space="preserve"> — rank 27. 90 days: 22 clicks — 0 top of search, 22 product pages, 0 rest of search (0% / 100% / 0%), 0 orders. Last 14 days: 5 clicks — 0 top of search, 5 product pages, 0 rest of search (0% / 100% / 0%). Last 8 days (09-15 → 09-22): 0 top-of-search clicks (0.0/day, against 0.0/day in the 31 days before); last 3 days 0 clicks. Top-of-search impression share 0.0%. Budget $5.00/day, last 7 days 0% used. Top of search converts 19.4% against a market 3.52%. The run writes modifier 55% → 121%, base $1.09 → $0.76. Correction: hold at today’s price.</w:t>
-      </w:r>
-    </w:p>
-    <w:p>
-      <w:pPr>
-        <w:spacing w:after="100"/>
-        <w:ind w:left="227"/>
-      </w:pPr>
-      <w:r>
-        <w:rPr>
-          <w:b/>
-        </w:rPr>
-        <w:t>Bamboo Cooling Sheets King Size-(LSV)-Exact-(Ranking)-DO-BAMBOO-KING-WHITE-6PCS</w:t>
-      </w:r>
-      <w:r>
-        <w:rPr>
-          <w:b w:val="0"/>
-          <w:i w:val="0"/>
-        </w:rPr>
-        <w:t xml:space="preserve"> — rank 16, target 9. 90 days: 54 clicks — 38 top of search, 8 product pages, 8 rest of search (70% / 15% / 15%), 6 orders. Last 14 days: 3 clicks — 0 top of search, 3 product pages, 0 rest of search (0% / 100% / 0%). Last 8 days (09-15 → 09-22): 0 top-of-search clicks (0.0/day, against 0.1/day in the 31 days before); last 3 days 0 clicks. Top-of-search impression share 3.87%. Budget $7.80/day, last 7 days 4% used. The run writes modifier 88% → 108% — top-of-search price $3.74 → $4.14. Correction: hold at today’s price.</w:t>
       </w:r>
     </w:p>
     <w:p>
@@ -2742,7 +2864,7 @@
         <w:pStyle w:val="Heading1"/>
       </w:pPr>
       <w:r>
-        <w:t>B.2 2 out-of-focus campaigns with product pages over 20% — cut the base, top of search held</w:t>
+        <w:t>B.3 1 out-of-focus campaigns with product pages over 20% — cut the base, top of search held</w:t>
       </w:r>
     </w:p>
     <w:p>
@@ -2762,25 +2884,6 @@
           <w:i w:val="0"/>
         </w:rPr>
         <w:t>Out of focus, the leak is still money landing on the placement that does not move rank — and it is where most of the product’s product-page clicks sit. Cut the base sized to the leak (10% at 20–30%, 20% at 30–50%, 35% above; never more than 25% where product pages carry orders), re-solve the modifier so the top-of-search price holds to the cent. No price climb.</w:t>
-      </w:r>
-    </w:p>
-    <w:p>
-      <w:pPr>
-        <w:spacing w:after="100"/>
-        <w:ind w:left="227"/>
-      </w:pPr>
-      <w:r>
-        <w:rPr>
-          <w:b/>
-        </w:rPr>
-        <w:t>Decolure Bamboo Sheets-(MSV)-Exact-(Ranking)-DO-BAMBOO-KING-WHITE-6PCS</w:t>
-      </w:r>
-      <w:r>
-        <w:rPr>
-          <w:b w:val="0"/>
-          <w:i w:val="0"/>
-        </w:rPr>
-        <w:t xml:space="preserve"> — no rank on file. 90 days: 745 clicks — 221 top of search, 511 product pages, 13 rest of search (30% / 69% / 2%), 182 orders. Last 14 days: 107 clicks — 50 top of search, 57 product pages, 0 rest of search (47% / 53% / 0%). Last 8 days (09-15 → 09-22): 32 top-of-search clicks (4.0/day, against 1.5/day in the 31 days before); last 3 days 23 clicks. Top-of-search impression share 21.0%. Budget $100.00/day, last 7 days 12% used. Top of search converts 26.2% against a market 1.92%. The run writes modifier 101% → 91% — top-of-search price $4.24 → $4.03. Correction: base −25% → $1.58, modifier 168% so top of search stays at $4.24.</w:t>
       </w:r>
     </w:p>
     <w:p>
@@ -2818,7 +2921,7 @@
           <w:b w:val="0"/>
           <w:i w:val="0"/>
         </w:rPr>
-        <w:t>All 2 get the base cut sized to their leak with the top-of-search price held; none gets a price climb.</w:t>
+        <w:t>All 1 get the base cut sized to their leak with the top-of-search price held; none gets a price climb.</w:t>
       </w:r>
     </w:p>
     <w:p>
@@ -2826,53 +2929,7 @@
         <w:pStyle w:val="Heading1"/>
       </w:pPr>
       <w:r>
-        <w:t>B.3 1 out-of-focus campaigns with a readable record — hold what works</w:t>
-      </w:r>
-    </w:p>
-    <w:p>
-      <w:pPr>
-        <w:spacing w:after="100"/>
-      </w:pPr>
-      <w:r>
-        <w:rPr>
-          <w:b/>
-          <w:color w:val="1F3A5F"/>
-        </w:rPr>
-        <w:t xml:space="preserve">The rule. </w:t>
-      </w:r>
-      <w:r>
-        <w:rPr>
-          <w:b w:val="0"/>
-          <w:i w:val="0"/>
-        </w:rPr>
-        <w:t>Out of focus means no new money; it does not mean take away what is working. A campaign converting at or above the market at top of search, with the right mix or climbing, is held flat — no increase, no cut.</w:t>
-      </w:r>
-    </w:p>
-    <w:p>
-      <w:pPr>
-        <w:spacing w:after="100"/>
-        <w:ind w:left="227"/>
-      </w:pPr>
-      <w:r>
-        <w:rPr>
-          <w:b/>
-        </w:rPr>
-        <w:t>Decolure Bamboo Sheets King Size-(VLSV)-Exact-(Ranking)-DO-BAMBOO-KING-WHITE-6PCS</w:t>
-      </w:r>
-      <w:r>
-        <w:rPr>
-          <w:b w:val="0"/>
-          <w:i w:val="0"/>
-        </w:rPr>
-        <w:t xml:space="preserve"> — no rank on file. 90 days: 82 clicks — 72 top of search, 2 product pages, 8 rest of search (88% / 2% / 10%), 32 orders. Last 14 days: 15 clicks — 13 top of search, 0 product pages, 2 rest of search (87% / 0% / 13%). Last 8 days (09-15 → 09-22): 11 top-of-search clicks (1.4/day, against 0.1/day in the 31 days before); last 3 days 2 clicks. Top-of-search impression share 30.39%. Budget $20.00/day, last 7 days 10% used. Top of search converts 41.7% against a market 6.71%. The run writes modifier 162% → 191%, base $1.35 → $1.22 — top-of-search price $3.54 → $3.55. Correction: hold flat — no cut, no raise.</w:t>
-      </w:r>
-    </w:p>
-    <w:p>
-      <w:pPr>
-        <w:pStyle w:val="Heading1"/>
-      </w:pPr>
-      <w:r>
-        <w:t>B.4 11 out-of-focus campaigns that went dark or faded</w:t>
+        <w:t>B.4 3 out-of-focus campaigns that went dark or faded</w:t>
       </w:r>
     </w:p>
     <w:p>
@@ -2922,14 +2979,14 @@
         <w:rPr>
           <w:b/>
         </w:rPr>
-        <w:t>Decolure Bamboo Sheets Queen Size-(VHSV)-Exact-(Ranking)-DO-BAMBOO-QUEEN-WHITE-6PCS</w:t>
+        <w:t>Bamboo Twin Sheets-[Bamboo|Twin]-(LSV)-Exact-(Ranking)-DO-BAMBOO-TWIN-WHITE-6PCS</w:t>
       </w:r>
       <w:r>
         <w:rPr>
           <w:b w:val="0"/>
           <w:i w:val="0"/>
         </w:rPr>
-        <w:t xml:space="preserve"> — no rank on file. 90 days: 165 clicks — 49 top of search, 114 product pages, 2 rest of search (30% / 69% / 1%), 43 orders. Last 14 days: 1 clicks — 1 top of search, 0 product pages, 0 rest of search (100% / 0% / 0%). Last 8 days (09-15 → 09-22): 1 top-of-search clicks (0.1/day, against 0.0/day in the 31 days before); last 3 days 0 clicks. Budget $100.00/day, last 7 days 0% used. The run holds it. Correction: restore the values before the 16 and 20 September changes and read the next day.</w:t>
+        <w:t xml:space="preserve"> — rank 21 → 27 in thirty days. 90 days: 82 clicks — 22 top of search, 59 product pages, 1 rest of search (27% / 72% / 1%), 6 orders. Last 14 days: no clicks. Last 8 days (09-15 → 09-22): 0 top-of-search clicks (0.0/day, against 0.4/day in the 31 days before); last 3 days 0 clicks. Top-of-search impression share 7.55%. Budget $10.00/day, last 7 days 0% used. Top of search converts 16.5% against a market 4.42%. The run writes modifier 426% → 383% — top-of-search price $4.63 → $4.25. On 11 September: TOS modifier 250→341; D-BS6-SP-EXACT-BAMBOO-TWIN-MIDGREY-6PCS-bamboo twin sheets 1.11→0.88. Correction: restore those values, read the next day.</w:t>
       </w:r>
     </w:p>
     <w:p>
@@ -2941,14 +2998,14 @@
         <w:rPr>
           <w:b/>
         </w:rPr>
-        <w:t>Bamboo Cooling Sheets-(MSV)-Exact-(Ranking)-DO-BAMBOO-KING-WHITE-6PCS</w:t>
+        <w:t>Bamboo Sheets Pink-(VLSV)-Exact-(Ranking)-DO-BAMBOO-KING-LIGHT PINK-6PCS</w:t>
       </w:r>
       <w:r>
         <w:rPr>
           <w:b w:val="0"/>
           <w:i w:val="0"/>
         </w:rPr>
-        <w:t xml:space="preserve"> — rank 25 → 25 in thirty days, target 5. 90 days: 407 clicks — 184 top of search, 202 product pages, 21 rest of search (45% / 50% / 5%), 49 orders. Last 14 days: 4 clicks — 1 top of search, 3 product pages, 0 rest of search (25% / 75% / 0%). Last 8 days (09-15 → 09-22): 1 top-of-search clicks (0.1/day, against 0.0/day in the 31 days before); last 3 days 1 clicks. Top-of-search impression share 12.18%. Budget $50.00/day, last 7 days 1% used. Top of search converts 15.2% against a market 1.83%. The run writes modifier 100% → 90% — top-of-search price $3.16 → $3.00. On 11 September: TOS modifier 50→100; DBS6-SP-Bamboo Cooling Sheets-(MSV)-Exact-(Ranking)-DO-BAMBOO-KING-WHITE-6PCS 2.1→1.58. Correction: restore those values, read the next day.</w:t>
+        <w:t xml:space="preserve"> — no rank on file. 90 days: 80 clicks — 14 top of search, 63 product pages, 3 rest of search (18% / 79% / 4%), 5 orders. Last 14 days: 3 clicks — 1 top of search, 2 product pages, 0 rest of search (33% / 67% / 0%). Last 8 days (09-15 → 09-22): 0 top-of-search clicks (0.0/day, against 0.3/day in the 31 days before); last 3 days 0 clicks. Top-of-search impression share 6.45%. Budget $60.00/day, last 7 days 0% used. Top of search converts 19.4% against a market 2.62%. The run writes modifier 603% → 543% — top-of-search price $6.96 → $6.37. On 11 September: TOS modifier 340→440; DBS6-SP-Bamboo Sheets Pink-(VLSV)-Exact-(Ranking)-DO-BAMBOO-KING-LIGHT PINK-6PCS 1.22→0.99. Correction: restore those values, read the next day.</w:t>
       </w:r>
     </w:p>
     <w:p>
@@ -2956,7 +3013,7 @@
         <w:pStyle w:val="Heading1"/>
       </w:pPr>
       <w:r>
-        <w:t>B.5 7 out-of-focus campaigns whose keyword lost more than 10 positions — investigate</w:t>
+        <w:t>B.5 2 out-of-focus campaigns whose keyword lost more than 10 positions — investigate</w:t>
       </w:r>
     </w:p>
     <w:p>
@@ -3006,25 +3063,6 @@
         <w:rPr>
           <w:b/>
         </w:rPr>
-        <w:t>Cooling Sheets For Hot Sleepers-(VLSV)-Exact-(Ranking)-DO-BAMBOO-KING-WHITE-6PCS</w:t>
-      </w:r>
-      <w:r>
-        <w:rPr>
-          <w:b w:val="0"/>
-          <w:i w:val="0"/>
-        </w:rPr>
-        <w:t xml:space="preserve"> — rank 45 → 95 in thirty days. 90 days: 88 clicks — 54 top of search, 23 product pages, 11 rest of search (61% / 26% / 12%), 17 orders. Last 14 days: no clicks. Last 8 days (09-15 → 09-22): 0 top-of-search clicks (0.0/day, against 0.0/day in the 31 days before); last 3 days 0 clicks. Budget $20.00/day, last 7 days 0% used. The run holds it. Correction: freeze price and budget; check the listing, the child the ad serves, the rival now ahead and the term’s volume.</w:t>
-      </w:r>
-    </w:p>
-    <w:p>
-      <w:pPr>
-        <w:spacing w:after="100"/>
-        <w:ind w:left="227"/>
-      </w:pPr>
-      <w:r>
-        <w:rPr>
-          <w:b/>
-        </w:rPr>
         <w:t>Queen Size Sheets Cooling-[Cooling|Queen]-(LSV)-Exact-(Ranking)-DO-BAMBOO-QUEEN-WHITE-6PCS</w:t>
       </w:r>
       <w:r>
@@ -3051,7 +3089,7 @@
           <w:b w:val="0"/>
           <w:i w:val="0"/>
         </w:rPr>
-        <w:t>Freeze all 7; name the cause on each before any price moves again.</w:t>
+        <w:t>Freeze all 2; name the cause on each before any price moves again.</w:t>
       </w:r>
     </w:p>
     <w:p>
@@ -4824,14 +4862,14 @@
           <w:b/>
           <w:i w:val="0"/>
         </w:rPr>
-        <w:t>The plan and the focus disagree.</w:t>
+        <w:t>The plan asks for terms the focus does not push.</w:t>
       </w:r>
       <w:r>
         <w:rPr>
           <w:b w:val="0"/>
           <w:i w:val="0"/>
         </w:rPr>
-        <w:t xml:space="preserve"> B6’s plan asks for 307 clicks a week on “bamboo sheets queen size” and 1,301 a week across ten cooling terms, but neither Bamboo|Queen nor any cooling group is in focus — the in-focus groups are Bamboo, Bamboo|King, Bamboo|Full and Bamboo|California King. Those requirements have no campaign pushing them.</w:t>
+        <w:t xml:space="preserve"> B6’s plan asks for 307 clicks a week on “bamboo sheets queen size” and 1,301 a week across ten cooling terms, but Bamboo|Queen and the cooling groups are out of focus. Focus stays as it is (operator decision); instead, the out-of-focus terms that already convert above the bar at the top — 9 Queen, 9 Cooling|King and 5 others — get a two-week test at +10% (section B.1), and the result feeds the next focus decision. Queen stock supports it: 2,879 units across colours (70 days of cover) and 1,884 inbound on 10-30, though the white hero is short (379) — the Queen tests run on the olive child (518).</w:t>
       </w:r>
     </w:p>
     <w:p>
@@ -4870,7 +4908,7 @@
           <w:b w:val="0"/>
           <w:i w:val="0"/>
         </w:rPr>
-        <w:t>Buy the traffic back where it performs: step the top-of-search price every day by the delivery gap, inside the loss stop (3× contribution per top-of-search order) and the spend envelope (Part A). Restore the campaigns the 11 September round took dark. Decide the plan/focus mismatch on Queen and Cooling. Keep B6’s terms during B4’s deal (operator decision) and read both listings’ share on the shared terms daily.</w:t>
+        <w:t>Buy the traffic back where it performs: step the top-of-search price every day by the delivery gap, inside the loss stop (3× contribution per top-of-search order) and the spend envelope (Part A). Restore the campaigns the 11 September round took dark. Keep focus as the plan sets it and test the out-of-focus terms that convert. Keep B6’s terms during B4’s deal (operator decision) and read both listings’ share on the shared terms daily.</w:t>
       </w:r>
     </w:p>
     <w:p>
@@ -13176,7 +13214,7 @@
           <w:b w:val="0"/>
           <w:i w:val="0"/>
         </w:rPr>
-        <w:t xml:space="preserve"> — Traffic gap: 9 clicks a week against the plan’s 307; CVR 32.8% at the top; impression share 0.4% at $4.56; sponsored position 4 on the ASINsight sample, organic 36. But Bamboo|Queen is not in B6’s focus, so no campaign is pushing it. Decide: bring Bamboo|Queen into focus and push it (it converts better than anything else B6 buys), or take the 307 clicks out of the plan.</w:t>
+        <w:t xml:space="preserve"> — Traffic gap: 9 clicks a week against the plan’s 307; CVR 32.8% at the top; impression share 0.4% at $4.56; sponsored position 4, organic 36. Bamboo|Queen stays out of focus (operator decision), so there is no full push; its converting campaigns — including the head-term “Bamboo Sheets Queen” (59 orders on 264 top-of-search clicks, 22%) — are in the two-week test on the olive child (section B.1). If the test holds, it is the case for bringing Queen into focus.</w:t>
       </w:r>
     </w:p>
     <w:p>
@@ -13256,7 +13294,7 @@
           <w:b w:val="0"/>
           <w:i w:val="0"/>
         </w:rPr>
-        <w:t xml:space="preserve"> — Not present: 1 top-of-search click a week on “bamboo cooling sheets” against 142 planned; “cooling sheets” (460 planned, organic 78) is barely bought at all. No cooling group is in focus. Decide with Queen: bring cooling into focus with its own campaigns, or remove the 1,301 weekly cooling clicks from the plan.</w:t>
+        <w:t xml:space="preserve"> — Not present: 1 top-of-search click a week on “bamboo cooling sheets” against 142 planned; “cooling sheets” (460 planned, organic 78, Bedsure leading at $59.99 against B6’s $89) is barely bought. Cooling stays out of focus; its 90-day ACoS is 40%, over break-even. Nine Cooling|King campaigns that convert above the bar at the top are in the two-week test (section B.1); the head term is not.</w:t>
       </w:r>
     </w:p>
     <w:p>
@@ -16635,7 +16673,7 @@
           <w:b w:val="0"/>
           <w:i w:val="0"/>
         </w:rPr>
-        <w:t>B6 keeps its terms (operator 2026-09-23): no top-of-search cut on the shared terms. Note that B4’s corrections document currently tells the 6-piece to set top of search to 0% on B4’s ranking terms for the deal — one of the two documents has to change so the listings do not get opposite instructions. Read both listings’ impression share on the shared hero terms daily: if both fall when both push, each is taking the other’s auctions.</w:t>
+        <w:t>B6 keeps its terms (operator 2026-09-23): no top-of-search cut on the shared terms. B4’s document is left as it is. Read both listings’ impression share on the shared hero terms daily: if both fall when both push, each is taking the other’s auctions.</w:t>
       </w:r>
     </w:p>
     <w:p>
@@ -17052,7 +17090,7 @@
                 <w:i w:val="0"/>
                 <w:sz w:val="15"/>
               </w:rPr>
-              <w:t>Queen and cooling exact — plan terms with no campaign in focus</w:t>
+              <w:t>Queen and cooling — out of focus, converting</w:t>
             </w:r>
           </w:p>
         </w:tc>
@@ -17084,7 +17122,7 @@
                 <w:i w:val="0"/>
                 <w:sz w:val="15"/>
               </w:rPr>
-              <w:t>“bamboo sheets queen size” (307 clicks/wk planned, CVR 32.8%) and ten cooling terms (1,301/wk planned) have no in-focus campaign.</w:t>
+              <w:t>“bamboo sheets queen size” (307 clicks/wk planned, CVR 32.8%) and the cooling terms (1,301/wk planned) have no in-focus campaign; 23 out-of-focus campaigns convert above the bar.</w:t>
             </w:r>
           </w:p>
         </w:tc>
@@ -17100,7 +17138,7 @@
                 <w:i w:val="0"/>
                 <w:sz w:val="15"/>
               </w:rPr>
-              <w:t>Decide focus first (D.1); if in, build the exact ranking campaigns; if out, take them out of the plan.</w:t>
+              <w:t>Two-week +10% test on the converters (B.1); decide focus on the 10-07 read.</w:t>
             </w:r>
           </w:p>
         </w:tc>
@@ -17899,14 +17937,14 @@
           <w:b/>
           <w:i w:val="0"/>
         </w:rPr>
-        <w:t>Decide the plan/focus mismatch:</w:t>
+        <w:t>Out of focus, converting:</w:t>
       </w:r>
       <w:r>
         <w:rPr>
           <w:b w:val="0"/>
           <w:i w:val="0"/>
         </w:rPr>
-        <w:t xml:space="preserve"> Bamboo|Queen (307 clicks/wk planned, the best converter B6 has) and cooling (1,301/wk planned) — in focus with campaigns, or out of the plan.</w:t>
+        <w:t xml:space="preserve"> focus stays as planned; test the 23 out-of-focus campaigns that convert above the bar at +10% for two weeks (Queen on the olive child, 1,884 Queen units landing 10-30), read on 10-07, and take that read into the next focus decision.</w:t>
       </w:r>
     </w:p>
     <w:p>
@@ -17946,7 +17984,7 @@
           <w:b w:val="0"/>
           <w:i w:val="0"/>
         </w:rPr>
-        <w:t xml:space="preserve"> B6 keeps them; read both listings’ share daily, and reconcile with B4’s document, which still tells the 6-piece to step back.</w:t>
+        <w:t xml:space="preserve"> B6 keeps them; read both listings’ share daily.</w:t>
       </w:r>
     </w:p>
     <w:p>
@@ -18066,7 +18104,7 @@
           <w:b w:val="0"/>
           <w:i w:val="0"/>
         </w:rPr>
-        <w:t>6. Out of focus: hold the 92 thin rows and the ones that work; cut the base on the 2 leakers with top of search held; restore or check the 11 that went dark or faded; freeze the 7 collapses.</w:t>
+        <w:t>6. Out of focus: hold the 84 thin rows and the ones that work; cut the base on the 1 leakers with top of search held; restore or check the 3 that went dark or faded; freeze the 2 collapses.</w:t>
       </w:r>
     </w:p>
     <w:p>
@@ -18078,7 +18116,7 @@
           <w:b w:val="0"/>
           <w:i w:val="0"/>
         </w:rPr>
-        <w:t>7. Other campaign types: bring the ones over their ceiling down on the base; leave the rest.</w:t>
+        <w:t>7. Out of focus, converting: test the 23 campaigns in section B.1 at +10% top of search for two weeks (Queen ones on the olive child); read on 10-07. Focus itself does not change.</w:t>
       </w:r>
     </w:p>
     <w:p>
@@ -18090,7 +18128,7 @@
           <w:b w:val="0"/>
           <w:i w:val="0"/>
         </w:rPr>
-        <w:t>8. B6 keeps its terms during B4’s deal (operator 2026-09-23): push them like any other in-focus term and read B6’s impression share on the shared terms daily beside B4’s — if both fall, one listing is taking the other’s auctions.</w:t>
+        <w:t>8. Other campaign types: bring the ones over their ceiling down on the base; leave the rest.</w:t>
       </w:r>
     </w:p>
     <w:p>
@@ -18102,7 +18140,7 @@
           <w:b w:val="0"/>
           <w:i w:val="0"/>
         </w:rPr>
-        <w:t>9. Grade the price step and the budget raise separately: price on impression share, budget on hours out of budget.</w:t>
+        <w:t>9. B6 keeps its terms during B4’s deal (operator 2026-09-23): push them like any other in-focus term and read B6’s impression share on the shared terms daily beside B4’s — if both fall, one listing is taking the other’s auctions.</w:t>
       </w:r>
     </w:p>
     <w:p>
@@ -18114,7 +18152,7 @@
           <w:b w:val="0"/>
           <w:i w:val="0"/>
         </w:rPr>
-        <w:t>10. This week: build the Sponsored Brands headline (3), Sponsored Brands Video (2), Sponsored Display defence and the conquest campaign from the run’s builds, at readable budgets; one phrase discovery per in-focus root.</w:t>
+        <w:t>10. Grade the price step and the budget raise separately: price on impression share, budget on hours out of budget.</w:t>
       </w:r>
     </w:p>
     <w:p>
@@ -18126,7 +18164,19 @@
           <w:b w:val="0"/>
           <w:i w:val="0"/>
         </w:rPr>
-        <w:t>11. From 09-29: campaigns at their requirement — probe cost per click down 3–5% a step while click share holds; campaigns short of it — step down to break-even over two writes four days apart (or hold one week where the 7-day rank reached the target range). Grade every write in this list.</w:t>
+        <w:t>11. This week: build the Sponsored Brands headline (3), Sponsored Brands Video (2), Sponsored Display defence and the conquest campaign from the run’s builds, at readable budgets; one phrase discovery per in-focus root.</w:t>
+      </w:r>
+    </w:p>
+    <w:p>
+      <w:pPr>
+        <w:spacing w:after="100"/>
+      </w:pPr>
+      <w:r>
+        <w:rPr>
+          <w:b w:val="0"/>
+          <w:i w:val="0"/>
+        </w:rPr>
+        <w:t>12. From 09-29: campaigns at their requirement — probe cost per click down 3–5% a step while click share holds; campaigns short of it — step down to break-even over two writes four days apart (or hold one week where the 7-day rank reached the target range). Grade every write in this list.</w:t>
       </w:r>
     </w:p>
     <w:sectPr>

</xml_diff>

<commit_message>
B6: envelope at the engine plan, 900% wall rule, live values, test budgets
Envelope $619/day (engine after-audit spend) for 09-24..09-28; base carries the
raise past the 900% modifier wall; rows priced from live 22 Sep values; third
in-focus campaign with no bid added; out-of-focus tests on budgets sized to ~15
TOS clicks; claims tightened (price buys share, tuning explains part of the drop,
campaign-level CVR for King/Queen/Full); run-action counts reconciled.

Co-Authored-By: Claude Opus 5.5 <noreply@anthropic.com>
Claude-Session: https://claude.ai/code/session_01FvXHKtbYmE3ru99HYV2muV
</commit_message>
<xml_diff>
--- a/docs/DBS6_Corrections_by_Situation_20260921-f066a8f0.docx
+++ b/docs/DBS6_Corrections_by_Situation_20260921-f066a8f0.docx
@@ -982,7 +982,7 @@
           <w:b w:val="0"/>
           <w:i w:val="0"/>
         </w:rPr>
-        <w:t>The base is held unless product pages are over 20% (then it comes down in the same write). The top-of-search modifier applies to every target in the campaign; a base cut is applied as the same percentage to every enabled target, and the price quoted is the plan keyword’s. Where 80% or more of the budget was used in the last 7 days, the budget goes up 30% in the same write.</w:t>
+        <w:t>The base is held unless product pages are over 20% (then it comes down in the same write). The top-of-search modifier applies to every target in the campaign; a base cut is applied as the same percentage to every enabled target, and the price quoted is the plan keyword’s. Amazon caps the modifier at 900%: where a step would pass it — common on B6 after the 11 September round left rows at 400–860% — the base carries the rest of the raise (base = price ÷ 10, modifier 900%) and product-page share is read the next day. Every row is priced from live values on the morning of the write (two rows here were moved on 22 September, after the audit, and are priced from those). Where 80% or more of the budget was used in the last 7 days, the budget goes up 30% in the same write.</w:t>
       </w:r>
     </w:p>
     <w:p>
@@ -1039,7 +1039,7 @@
           <w:b w:val="0"/>
           <w:i w:val="0"/>
         </w:rPr>
-        <w:t>Of the 51 in-focus campaigns that should be pushed, the run raised the top-of-search price on 12, cut it on 3 and held 29. It held rows for being thin, for no rank read, for a rank collapse, for sitting at its market bound, and on budget.</w:t>
+        <w:t>Of the 51 in-focus campaigns that should be pushed, the run raised the top-of-search price on 12, cut it on 3 and left it where it was on 36 (29 untouched, 7 with other moves that leave the top-of-search price unchanged). It held rows for being thin, for no rank read, for a rank collapse, for sitting at its market bound, and on budget.</w:t>
       </w:r>
     </w:p>
     <w:p>
@@ -1470,7 +1470,7 @@
                 <w:i w:val="0"/>
                 <w:sz w:val="15"/>
               </w:rPr>
-              <w:t>$7</w:t>
+              <w:t>$8</w:t>
             </w:r>
           </w:p>
         </w:tc>
@@ -1912,21 +1912,35 @@
           <w:b w:val="0"/>
           <w:i w:val="0"/>
         </w:rPr>
-        <w:t xml:space="preserve">These campaigns spent $109 a day over the last 8 days. The push runs inside 1.5× that for 09-24 → 09-28: </w:t>
+        <w:t xml:space="preserve">These campaigns spent $109 a day over the last 8 days; B6’s whole ad account ran $349 a day over 14 days. The push is funded at the engine’s own plan for this run — </w:t>
       </w:r>
       <w:r>
         <w:rPr>
           <w:b/>
           <w:i w:val="0"/>
         </w:rPr>
-        <w:t>$816</w:t>
+        <w:t>$619 a day</w:t>
       </w:r>
       <w:r>
         <w:rPr>
           <w:b w:val="0"/>
           <w:i w:val="0"/>
         </w:rPr>
-        <w:t xml:space="preserve"> in total ($163 a day). At the new prices with clicks unchanged they would spend about $125 a day; every click the push adds comes on top, so the envelope — not a price cap — is what ends an over-running push. The loss per order is computed on the full top-of-search price; what Amazon charges is at or below it, so it is an upper bound.</w:t>
+        <w:t xml:space="preserve"> (the audit workbook’s after-audit ad spend, $618.71), </w:t>
+      </w:r>
+      <w:r>
+        <w:rPr>
+          <w:b/>
+          <w:i w:val="0"/>
+        </w:rPr>
+        <w:t>$3,094</w:t>
+      </w:r>
+      <w:r>
+        <w:rPr>
+          <w:b w:val="0"/>
+          <w:i w:val="0"/>
+        </w:rPr>
+        <w:t xml:space="preserve"> for 09-24 → 09-28 (operator 2026-09-23). At the new prices with clicks unchanged these campaigns would spend about $125 a day; the rest of the $619 is room for the clicks the push buys. Rows keep stepping daily while impression share rises, inside the loss stop, until the envelope is spent. Buying the whole plan requirement at the new prices would cost about $1,050 a day — the level the 20 September review endorsed; that is the next funding question, after this week’s read.</w:t>
       </w:r>
     </w:p>
     <w:p>
@@ -2024,7 +2038,7 @@
           <w:b w:val="0"/>
           <w:i w:val="0"/>
         </w:rPr>
-        <w:t xml:space="preserve"> — rank 27, target 10. 90 days: 239 clicks — 99 top of search, 133 product pages, 7 rest of search (41% / 56% / 3%), 40 orders. Last 14 days: 12 clicks — 9 top of search, 3 product pages, 0 rest of search (75% / 25% / 0%). Last 8 days (09-15 → 09-22): 5 top-of-search clicks (0.6/day, against 0.4/day in the 31 days before); last 3 days 2 clicks. Top-of-search impression share 10.19%. Budget $30.00/day, last 7 days 16% used. The run writes modifier 247% → 285%, base $1.85 → $1.67. Correction: +20% (no click requirement on file → +20% (a stated departure: the logic document would hold at the ceiling)) — TOS $6.42 → $7.70; a top-of-search order then costs up to $33 (a loss of $10 against $23.14 contribution; stop at $16.13); impression share 2.2% (30 days) → 6.7% (last 8 days); modifier 316%.</w:t>
+        <w:t xml:space="preserve"> — rank 27, target 10. 90 days: 239 clicks — 99 top of search, 133 product pages, 7 rest of search (41% / 56% / 3%), 40 orders. Last 14 days: 12 clicks — 9 top of search, 3 product pages, 0 rest of search (75% / 25% / 0%). Last 8 days (09-15 → 09-22): 5 top-of-search clicks (0.6/day, against 0.4/day in the 31 days before); last 3 days 2 clicks. Top-of-search impression share 10.19%. Budget $30.00/day, last 7 days 16% used. The run writes modifier 247% → 285%, base $1.85 → $1.67. Correction: +20% (no click requirement on file → +20% (a stated departure: the logic document would hold at the ceiling)) — TOS $8.34 → $10.01; a top-of-search order then costs up to $43 (a loss of $20 against $23.14 contribution; stop at $16.13); impression share 2.2% (30 days) → 6.7% (last 8 days); modifier 441%.</w:t>
       </w:r>
     </w:p>
     <w:p>
@@ -2463,7 +2477,7 @@
         <w:pStyle w:val="Heading1"/>
       </w:pPr>
       <w:r>
-        <w:t>A.7 2 in-focus campaigns whose only keyword is paused — not a push</w:t>
+        <w:t>A.7 3 in-focus campaigns that cannot serve — keyword paused or no bid on file</w:t>
       </w:r>
     </w:p>
     <w:p>
@@ -2521,6 +2535,25 @@
           <w:i w:val="0"/>
         </w:rPr>
         <w:t xml:space="preserve"> — rank 24 → 34 in thirty days, target 10. 90 days: 124 clicks — 23 top of search, 90 product pages, 11 rest of search (19% / 73% / 9%), 21 orders. Last 14 days: no clicks. Last 8 days (09-15 → 09-22): 0 top-of-search clicks (0.0/day, against 0.0/day in the 31 days before); last 3 days 0 clicks. Plan needs 30 paid clicks a week (4.3/day). Budget $20.00/day, last 7 days 0% used. The run holds it. Its only keyword is paused and no other enabled exact campaign carries the term, so the term has left the ranking programme without a decision. Correction: re-enable the keyword at its last serving values and put it in the push — or, if the pause was deliberate, take the campaign out of focus and say why.</w:t>
+      </w:r>
+    </w:p>
+    <w:p>
+      <w:pPr>
+        <w:spacing w:after="100"/>
+        <w:ind w:left="227"/>
+      </w:pPr>
+      <w:r>
+        <w:rPr>
+          <w:b/>
+        </w:rPr>
+        <w:t>Bamboo King Sheets Set-[Bamboo|King]-(VLSV)-Exact-(Ranking)-DO-BAMBOO-KING-WHITE-6PCS</w:t>
+      </w:r>
+      <w:r>
+        <w:rPr>
+          <w:b w:val="0"/>
+          <w:i w:val="0"/>
+        </w:rPr>
+        <w:t xml:space="preserve"> — no rank on file. 90 days: 2 clicks — 2 top of search, 0 product pages, 0 rest of search (100% / 0% / 0%), 3 orders. Last 14 days: no clicks. Last 8 days (09-15 → 09-22): 0 top-of-search clicks (0.0/day, against 0.0/day in the 31 days before); last 3 days 0 clicks. Budget $10.00/day, last 7 days 0% used. The run holds it. It is enabled with an enabled target but carries no bid on file, so it cannot serve and the push has nothing to step. Correction: set its bid so the top-of-search price sits at its market bound ($6.38) at the current 110% modifier — a base of $3.04 — then it joins the push on the next day’s read.</w:t>
       </w:r>
     </w:p>
     <w:p>
@@ -2670,6 +2703,25 @@
           <w:b/>
           <w:color w:val="1F3A5F"/>
         </w:rPr>
+        <w:t xml:space="preserve">The test budget. </w:t>
+      </w:r>
+      <w:r>
+        <w:rPr>
+          <w:b w:val="0"/>
+          <w:i w:val="0"/>
+        </w:rPr>
+        <w:t>Each test runs on a budget sized to about 15 top-of-search clicks over the two weeks at its test price (price × 15 ÷ 14 a day, at least $5): $136 a day across the 23, in place of the $863 a day their current budgets allow. Out of focus takes no new money beyond this.</w:t>
+      </w:r>
+    </w:p>
+    <w:p>
+      <w:pPr>
+        <w:spacing w:after="100"/>
+      </w:pPr>
+      <w:r>
+        <w:rPr>
+          <w:b/>
+          <w:color w:val="1F3A5F"/>
+        </w:rPr>
         <w:t xml:space="preserve">The read on 10-07. </w:t>
       </w:r>
       <w:r>
@@ -2715,7 +2767,7 @@
           <w:b w:val="0"/>
           <w:i w:val="0"/>
         </w:rPr>
-        <w:t xml:space="preserve"> — rank 32 → 52 in thirty days, target 5. 90 days: 463 clicks — 264 top of search, 197 product pages, 2 rest of search (57% / 43% / 0%), 78 orders. Last 14 days: 3 clicks — 0 top of search, 3 product pages, 0 rest of search (0% / 100% / 0%). Last 8 days (09-15 → 09-22): 0 top-of-search clicks (0.0/day, against 0.0/day in the 31 days before); last 3 days 0 clicks. Top-of-search impression share 4.53%. Budget $150.00/day, last 7 days 0% used. The run writes modifier 88% → 79%. Converts 59 of 264 top-of-search clicks (22%) against a bar of 13.3%. It has no enabled priced target on file today. Correction: re-enable its keyword and set the top-of-search price at its group’s market bound ($6.09), inside the stop ($19.27), as the test; advertise BAMBOO-QUEEN-OLIVE-6PCS — the hero BAMBOO-QUEEN-WHITE-6PCS is short; its rank collapsed — run the cause check the same day; read on 10-07</w:t>
+        <w:t xml:space="preserve"> — rank 32 → 52 in thirty days, target 5. 90 days: 463 clicks — 264 top of search, 197 product pages, 2 rest of search (57% / 43% / 0%), 78 orders. Last 14 days: 3 clicks — 0 top of search, 3 product pages, 0 rest of search (0% / 100% / 0%). Last 8 days (09-15 → 09-22): 0 top-of-search clicks (0.0/day, against 0.0/day in the 31 days before); last 3 days 0 clicks. Top-of-search impression share 4.53%. Budget $150.00/day, last 7 days 0% used. The run writes modifier 88% → 79%. Converts 59 of 264 top-of-search clicks (22%) against a bar of 13.3%. It has no enabled priced target on file today. Correction: re-enable its keyword and set the top-of-search price at its group’s market bound ($6.09), inside the stop ($19.27), as the test; budget $150.00 → $6.52 (about 15 top-of-search clicks in two weeks); advertise BAMBOO-QUEEN-OLIVE-6PCS — the hero BAMBOO-QUEEN-WHITE-6PCS is short; its rank collapsed — run the cause check the same day; read on 10-07</w:t>
       </w:r>
     </w:p>
     <w:p>
@@ -2734,7 +2786,7 @@
           <w:b w:val="0"/>
           <w:i w:val="0"/>
         </w:rPr>
-        <w:t xml:space="preserve"> — no rank on file. 90 days: 745 clicks — 221 top of search, 511 product pages, 13 rest of search (30% / 69% / 2%), 182 orders. Last 14 days: 107 clicks — 50 top of search, 57 product pages, 0 rest of search (47% / 53% / 0%). Last 8 days (09-15 → 09-22): 32 top-of-search clicks (4.0/day, against 1.5/day in the 31 days before); last 3 days 23 clicks. Top-of-search impression share 21.0%. Budget $100.00/day, last 7 days 12% used. Top of search converts 26.2% against a market 1.92%. The run writes modifier 101% → 91% — top-of-search price $4.24 → $4.03. Converts 58 of 221 top-of-search clicks (26%) against a bar of 5.8%. Correction: test +10% — TOS $4.24 → $4.67; a top-of-search order then costs up to $18 (still a profit of $10 against $27.37 contribution; stop at $21.55); read on 10-07</w:t>
+        <w:t xml:space="preserve"> — no rank on file. 90 days: 745 clicks — 221 top of search, 511 product pages, 13 rest of search (30% / 69% / 2%), 182 orders. Last 14 days: 107 clicks — 50 top of search, 57 product pages, 0 rest of search (47% / 53% / 0%). Last 8 days (09-15 → 09-22): 32 top-of-search clicks (4.0/day, against 1.5/day in the 31 days before); last 3 days 23 clicks. Top-of-search impression share 21.0%. Budget $100.00/day, last 7 days 12% used. Top of search converts 26.2% against a market 1.92%. The run writes modifier 101% → 91% — top-of-search price $4.24 → $4.03. Converts 58 of 221 top-of-search clicks (26%) against a bar of 5.8%. Correction: test +10% — TOS $4.24 → $4.67; a top-of-search order then costs up to $18 (still a profit of $10 against $27.37 contribution; stop at $21.55); budget $100.00 → $5.00 (about 15 top-of-search clicks in two weeks); read on 10-07</w:t>
       </w:r>
     </w:p>
     <w:p>
@@ -2753,7 +2805,7 @@
           <w:b w:val="0"/>
           <w:i w:val="0"/>
         </w:rPr>
-        <w:t xml:space="preserve"> — rank 17 → 34 in thirty days, target 5. 90 days: 1485 clicks — 213 top of search, 1265 product pages, 7 rest of search (14% / 85% / 0%), 189 orders. Last 14 days: 23 clicks — 5 top of search, 18 product pages, 0 rest of search (22% / 78% / 0%). Last 8 days (09-15 → 09-22): 3 top-of-search clicks (0.4/day, against 1.1/day in the 31 days before); last 3 days 4 clicks. Top-of-search impression share 2.01%. Budget $78.00/day, last 7 days 3% used. Top of search converts 20.7% against a market 4.21%. The run writes modifier 283% → 383%, base $1.19 → $0.94 — top-of-search price $4.56 → $4.54. Converts 44 of 213 top-of-search clicks (21%) against a bar of 12.6%. Correction: test +10% — TOS $4.56 → $5.01; a top-of-search order then costs up to $24 (still a profit of $2 against $26.49 contribution; stop at $16.42); advertise BAMBOO-QUEEN-OLIVE-6PCS — the hero BAMBOO-QUEEN-WHITE-6PCS is short; its rank collapsed — run the cause check the same day; read on 10-07</w:t>
+        <w:t xml:space="preserve"> — rank 17 → 34 in thirty days, target 5. 90 days: 1485 clicks — 213 top of search, 1265 product pages, 7 rest of search (14% / 85% / 0%), 189 orders. Last 14 days: 23 clicks — 5 top of search, 18 product pages, 0 rest of search (22% / 78% / 0%). Last 8 days (09-15 → 09-22): 3 top-of-search clicks (0.4/day, against 1.1/day in the 31 days before); last 3 days 4 clicks. Top-of-search impression share 2.01%. Budget $78.00/day, last 7 days 3% used. Top of search converts 20.7% against a market 4.21%. The run writes modifier 283% → 383%, base $1.19 → $0.94 — top-of-search price $4.56 → $4.54. Converts 44 of 213 top-of-search clicks (21%) against a bar of 12.6%. Correction: test +10% — TOS $4.56 → $5.01; a top-of-search order then costs up to $24 (still a profit of $2 against $26.49 contribution; stop at $16.42); budget $78.00 → $5.37 (about 15 top-of-search clicks in two weeks); advertise BAMBOO-QUEEN-OLIVE-6PCS — the hero BAMBOO-QUEEN-WHITE-6PCS is short; its rank collapsed — run the cause check the same day; read on 10-07</w:t>
       </w:r>
     </w:p>
     <w:p>
@@ -4741,7 +4793,7 @@
           <w:b w:val="0"/>
           <w:i w:val="0"/>
         </w:rPr>
-        <w:t xml:space="preserve"> first, and a traffic gap the tuning made. On B6’s main ranking keywords, top-of-search clicks beat the app’s CTR bar (1.1× market) and CVR bar (3× market) wherever there is enough sample — but B6 wins almost none of the top-of-search auctions, and its ad traffic was cut by two-thirds over the last month. Rank has fallen on every tracked group as the traffic went.</w:t>
+        <w:t xml:space="preserve"> first — part of it made by the tuning, and the larger part (the late-August drop) unexplained until the console’s change history is pulled. On B6’s main ranking keywords, top-of-search clicks beat the app’s CTR bar (1.1× market) and CVR bar (3× market) wherever there is enough sample — but B6 wins almost none of the top-of-search auctions, and its ad traffic was cut by two-thirds over the last month. Rank has fallen on every tracked group as the traffic went.</w:t>
       </w:r>
     </w:p>
     <w:p>
@@ -4829,7 +4881,7 @@
           <w:b w:val="0"/>
           <w:i w:val="0"/>
         </w:rPr>
-        <w:t xml:space="preserve"> “bamboo sheets” top-of-search CTR 3.0% vs a 1.9% bar, CVR 18.8% vs 8.3%; “queen size” 5.9% / 32.8% vs 1.8% / 13.3%; “viscose bamboo sheets” 4.6% / 23.4%. B6 converts better at the top than B4 on the same head term (18.8% vs 12.7%). The syntax-level estimate shows B6’s King, Queen and Full groups under the 3× CVR bar, but on 5–13 estimated orders from a split, not measured; the keyword rows do not show it (D.4).</w:t>
+        <w:t xml:space="preserve"> “bamboo sheets” top-of-search CTR 3.0% vs a 1.9% bar, CVR 18.8% vs 8.3%; “queen size” 5.9% / 32.8% vs 1.8% / 13.3%; “viscose bamboo sheets” 4.6% / 23.4%. B6 converts better at the top than B4 on the same head term (18.8% vs 12.7%). The syntax-level estimate shows B6’s King, Queen and Full groups under the 3× CVR bar, but that is a split estimate on 5–13 orders; measured at campaign level over 90 days they convert at 23%, 22.5% and 21% at the top, well above their bars (D.4).</w:t>
       </w:r>
     </w:p>
     <w:p>
@@ -4842,14 +4894,14 @@
           <w:b/>
           <w:i w:val="0"/>
         </w:rPr>
-        <w:t>The tuning took the traffic away.</w:t>
+        <w:t>The traffic went, partly through the tuning.</w:t>
       </w:r>
       <w:r>
         <w:rPr>
           <w:b w:val="0"/>
           <w:i w:val="0"/>
         </w:rPr>
-        <w:t xml:space="preserve"> Ad clicks fell from 310 a day (late June–July) to 265, 197 and then 101 in the last 8 days; orders from 45 to 13 a day. The 11 September round cut ranking spend in half and top-of-search clicks by a quarter. ACoS improved (29% → 24%) because B6 was buying less. Every tracked group lost rank: Bamboo 21 → 31, Bamboo|King 20 → 28, Bamboo|Queen 18 → 39 (7-day medians, June → 22 Sep).</w:t>
+        <w:t xml:space="preserve"> Ad clicks fell from 310 a day (late June–July) to 265, 197 and then 101 in the last 8 days; orders from 45 to 13 a day. The logged rounds account for the later step — the 11 September round cut ranking spend in half and top-of-search clicks by a quarter. The larger drop, about 350 to 114 clicks a day between 26 August and 5 September, has no logged decision behind it (D.2). ACoS improved (29% → 24%) because B6 was buying less. Every tracked group lost rank: Bamboo 21 → 31, Bamboo|King 20 → 28, Bamboo|Queen 18 → 39 (7-day medians, June → 22 Sep).</w:t>
       </w:r>
     </w:p>
     <w:p>
@@ -4882,14 +4934,14 @@
           <w:b/>
           <w:i w:val="0"/>
         </w:rPr>
-        <w:t>The one group that got volume moved.</w:t>
+        <w:t>Price buys share on B6.</w:t>
       </w:r>
       <w:r>
         <w:rPr>
           <w:b w:val="0"/>
           <w:i w:val="0"/>
         </w:rPr>
-        <w:t xml:space="preserve"> “bamboo sheets full” took impression share from 1.2% to 17.7% in the last 8 days and its rank went 58 → 12 over the summer (organic 19, sponsored 7): price bought share, and share bought rank.</w:t>
+        <w:t xml:space="preserve"> “bamboo sheets full” took impression share from 1.2% to 17.7% in the last 8 days after its price rose. Its rank climb (58 → 12) came earlier in the summer, before that jump, and the Bamboo|Full group has drifted 16 → 23 since mid-August — so whether the new share moves rank is the read still to be made.</w:t>
       </w:r>
     </w:p>
     <w:p>
@@ -4908,7 +4960,7 @@
           <w:b w:val="0"/>
           <w:i w:val="0"/>
         </w:rPr>
-        <w:t>Buy the traffic back where it performs: step the top-of-search price every day by the delivery gap, inside the loss stop (3× contribution per top-of-search order) and the spend envelope (Part A). Restore the campaigns the 11 September round took dark. Keep focus as the plan sets it and test the out-of-focus terms that convert. Keep B6’s terms during B4’s deal (operator decision) and read both listings’ share on the shared terms daily.</w:t>
+        <w:t>Buy the traffic back where it performs: step the top-of-search price every day by the delivery gap, inside the loss stop (3× contribution per top-of-search order) and the $619-a-day envelope (Part A). Restore the campaigns the 11 September round took dark. Keep focus as the plan sets it and test the out-of-focus terms that convert. Keep B6’s terms during B4’s deal (operator decision) and read both listings’ share on the shared terms daily.</w:t>
       </w:r>
     </w:p>
     <w:p>
@@ -10266,7 +10318,7 @@
           <w:b w:val="0"/>
           <w:i w:val="0"/>
         </w:rPr>
-        <w:t>The Bamboo group — two-thirds of B6’s spend — meets both bars at top of search at 2–3% impression share: a traffic gap. Bamboo|King, Bamboo|Queen and Bamboo|Full read under the 3× CVR bar at top of search, but that CVR is an estimate from each keyword’s campaigns’ placement split on 5–13 estimated orders, while the same groups convert at 12–16% overall and the keyword rows below convert above the bar; treat it as “verify on the campaign’s own placement report” before any bid goes in, not as a proven performance gap. The cooling groups are barely bought (under $1,000 in 30 days across all of them) — the plan asks for them, the focus does not include them.</w:t>
+        <w:t>The Bamboo group — two-thirds of B6’s spend — meets both bars at top of search at 2–3% impression share: a traffic gap. Bamboo|King, Bamboo|Queen and Bamboo|Full read under the 3× CVR bar in this table, but that CVR is estimated from each keyword’s campaigns’ placement split on 5–13 orders. Measured directly on the campaigns’ own placement reports over 90 days, top of search converts at 23.3% on Bamboo|King (276 orders on 1,187 clicks), 22.5% on Bamboo|Queen and 21.1% on Bamboo|Full — above every bar (10.8%, 13.3%, 12.2%). They are traffic gaps too, and the push in Part A stands. The cooling groups are barely bought (under $1,000 in 30 days across all of them) and stay out of focus.</w:t>
       </w:r>
     </w:p>
     <w:p>
@@ -13234,7 +13286,7 @@
           <w:b w:val="0"/>
           <w:i w:val="0"/>
         </w:rPr>
-        <w:t xml:space="preserve"> — Traffic gap: 4 a week against 170; 0.6% impression share at $4.80; rank 15 → 36. Its campaign “Bamboo Sheets King Size-(HSV)” went dark after the 11 September round left it at a $0.50 base with an 860% modifier — restore the base and push.</w:t>
+        <w:t xml:space="preserve"> — Traffic gap: 4 a week against 170; 0.6% impression share at $4.80; rank 15 → 36. Its campaign “Bamboo Sheets King Size-(HSV)” went dark after the 11 September round left it at a $0.50 base with an 860% modifier ($4.80 at the top). The +30% step to $6.24 cannot be carried by the modifier (it would need 1,148%), so the base carries it: base $0.50 → $0.62, modifier 900% — above its pre-cut $0.54, because at the new price the wall needs it. About $36 a top-of-search order at its 17.5% conversion.</w:t>
       </w:r>
     </w:p>
     <w:p>
@@ -13254,7 +13306,7 @@
           <w:b w:val="0"/>
           <w:i w:val="0"/>
         </w:rPr>
-        <w:t xml:space="preserve"> — The proof that price buys rank on B6: impression share 1.2% → 17.7% in the last 8 days at $6.50, rank 58 → 12 over the summer (organic 19, sponsored 7). 18% of its requirement delivered → +30% to $8.46, about $38 a top-of-search order. Keep stepping while share rises.</w:t>
+        <w:t xml:space="preserve"> — The proof that price buys share on B6: impression share 1.2% → 17.7% in the last 8 days at $6.50 (organic 19, sponsored 7). Its rank climb (58 → 12) came earlier in the summer, before that jump; whether the new share moves rank is the read to make. 18% of its requirement delivered → +30%; its modifier is already high after the 11 September round, so the next step will need the base to carry it (900% wall, Part A). Keep stepping while share rises.</w:t>
       </w:r>
     </w:p>
     <w:p>
@@ -17904,7 +17956,7 @@
           <w:b w:val="0"/>
           <w:i w:val="0"/>
         </w:rPr>
-        <w:t xml:space="preserve"> push every in-focus exact ranking campaign on top of search daily by the delivery gap (Part A), inside the loss stop (3× contribution per top-of-search order) and the envelope; restore the bases the 11 September round cut on the campaigns that went dark, in the same write. Read impression share and clicks every morning; share flat after a step = halve the next step and check the base, the 4-piece on the same term, and eligibility.</w:t>
+        <w:t xml:space="preserve"> push every in-focus exact ranking campaign on top of search daily by the delivery gap (Part A), inside the loss stop (3× contribution per top-of-search order) and the $619-a-day envelope; restore the bases the 11 September round cut on the campaigns that went dark, in the same write. Read impression share and clicks every morning; share flat after a step = halve the next step and check the base, the 4-piece on the same term, and eligibility.</w:t>
       </w:r>
     </w:p>
     <w:p>
@@ -17924,7 +17976,7 @@
           <w:b w:val="0"/>
           <w:i w:val="0"/>
         </w:rPr>
-        <w:t xml:space="preserve"> “bamboo sheets” (flagship, +15% to $7.01 with its pre-cut base restored), “bamboo sheets full” (+30% to $8.46 — the term already proving that share buys rank), “bamboo sheets king size” (restore, then push). Budget is not the constraint on B6 — the flagship uses 16% of its budget.</w:t>
+        <w:t xml:space="preserve"> “bamboo sheets” (flagship, +15% to $7.01 with its pre-cut base restored), “bamboo sheets full” (+30% — the term already showing that price buys share), “bamboo sheets king size” (restore, then push). Budget is not the constraint on B6 — the flagship uses 16% of its budget.</w:t>
       </w:r>
     </w:p>
     <w:p>
@@ -18068,7 +18120,7 @@
           <w:b w:val="0"/>
           <w:i w:val="0"/>
         </w:rPr>
-        <w:t>3. Write the push: 50 in-focus campaigns stepped on top of search by delivery gap, inside the loss stop and the $816 envelope; base cut on the in-focus leakers; budget +30% where 80%+ is used.</w:t>
+        <w:t>3. Write the push: 50 in-focus campaigns stepped on top of search by delivery gap, inside the loss stop and the $3,094 envelope ($619 a day); base cut on the in-focus leakers; budget +30% where 80%+ is used.</w:t>
       </w:r>
     </w:p>
     <w:p>
@@ -18116,7 +18168,7 @@
           <w:b w:val="0"/>
           <w:i w:val="0"/>
         </w:rPr>
-        <w:t>7. Out of focus, converting: test the 23 campaigns in section B.1 at +10% top of search for two weeks (Queen ones on the olive child); read on 10-07. Focus itself does not change.</w:t>
+        <w:t>7. Out of focus, converting: test the 23 campaigns in section B.1 at +10% top of search for two weeks on budgets sized to ~15 top-of-search clicks each ($136 a day in total; Queen ones on the olive child); read on 10-07. Focus itself does not change.</w:t>
       </w:r>
     </w:p>
     <w:p>

</xml_diff>